<commit_message>
Updating & Adding Lazy Segment Tree
</commit_message>
<xml_diff>
--- a/Graph_Theory/Graph_Theory.docx
+++ b/Graph_Theory/Graph_Theory.docx
@@ -153,6 +153,1665 @@
         <w:t>Table Of Contents:</w:t>
       </w:r>
     </w:p>
+    <w:sdt>
+      <w:sdtPr>
+        <w:id w:val="-2017145601"/>
+        <w:docPartObj>
+          <w:docPartGallery w:val="Table of Contents"/>
+          <w:docPartUnique/>
+        </w:docPartObj>
+      </w:sdtPr>
+      <w:sdtEndPr>
+        <w:rPr>
+          <w:rFonts w:asciiTheme="minorHAnsi" w:eastAsiaTheme="minorHAnsi" w:hAnsiTheme="minorHAnsi" w:cstheme="minorBidi"/>
+          <w:b/>
+          <w:bCs/>
+          <w:noProof/>
+          <w:color w:val="auto"/>
+          <w:kern w:val="2"/>
+          <w:sz w:val="24"/>
+          <w:szCs w:val="24"/>
+          <w14:ligatures w14:val="standardContextual"/>
+        </w:rPr>
+      </w:sdtEndPr>
+      <w:sdtContent>
+        <w:p>
+          <w:pPr>
+            <w:pStyle w:val="TOCHeading"/>
+          </w:pPr>
+          <w:r>
+            <w:t>Contents</w:t>
+          </w:r>
+        </w:p>
+        <w:p>
+          <w:pPr>
+            <w:pStyle w:val="TOC1"/>
+            <w:tabs>
+              <w:tab w:val="right" w:leader="dot" w:pos="9016"/>
+            </w:tabs>
+            <w:bidi w:val="0"/>
+            <w:rPr>
+              <w:rFonts w:eastAsiaTheme="minorEastAsia"/>
+              <w:noProof/>
+              <w:rtl/>
+            </w:rPr>
+          </w:pPr>
+          <w:r>
+            <w:fldChar w:fldCharType="begin"/>
+          </w:r>
+          <w:r>
+            <w:instrText xml:space="preserve"> TOC \o "1-3" \h \z \u </w:instrText>
+          </w:r>
+          <w:r>
+            <w:fldChar w:fldCharType="separate"/>
+          </w:r>
+          <w:hyperlink w:anchor="_Toc227795084" w:history="1">
+            <w:r>
+              <w:rPr>
+                <w:rStyle w:val="Hyperlink"/>
+                <w:noProof/>
+              </w:rPr>
+              <w:t>Articulation Points (Tarjan’s Algorithm):</w:t>
+            </w:r>
+            <w:r>
+              <w:rPr>
+                <w:noProof/>
+                <w:webHidden/>
+                <w:rtl/>
+              </w:rPr>
+              <w:tab/>
+            </w:r>
+            <w:r>
+              <w:rPr>
+                <w:noProof/>
+                <w:webHidden/>
+                <w:rtl/>
+              </w:rPr>
+              <w:fldChar w:fldCharType="begin"/>
+            </w:r>
+            <w:r>
+              <w:rPr>
+                <w:noProof/>
+                <w:webHidden/>
+                <w:rtl/>
+              </w:rPr>
+              <w:instrText xml:space="preserve"> </w:instrText>
+            </w:r>
+            <w:r>
+              <w:rPr>
+                <w:noProof/>
+                <w:webHidden/>
+              </w:rPr>
+              <w:instrText>PAGEREF</w:instrText>
+            </w:r>
+            <w:r>
+              <w:rPr>
+                <w:noProof/>
+                <w:webHidden/>
+                <w:rtl/>
+              </w:rPr>
+              <w:instrText xml:space="preserve"> _</w:instrText>
+            </w:r>
+            <w:r>
+              <w:rPr>
+                <w:noProof/>
+                <w:webHidden/>
+              </w:rPr>
+              <w:instrText>Toc227795084 \h</w:instrText>
+            </w:r>
+            <w:r>
+              <w:rPr>
+                <w:noProof/>
+                <w:webHidden/>
+                <w:rtl/>
+              </w:rPr>
+              <w:instrText xml:space="preserve"> </w:instrText>
+            </w:r>
+            <w:r>
+              <w:rPr>
+                <w:noProof/>
+                <w:webHidden/>
+                <w:rtl/>
+              </w:rPr>
+            </w:r>
+            <w:r>
+              <w:rPr>
+                <w:noProof/>
+                <w:webHidden/>
+                <w:rtl/>
+              </w:rPr>
+              <w:fldChar w:fldCharType="separate"/>
+            </w:r>
+            <w:r>
+              <w:rPr>
+                <w:noProof/>
+                <w:webHidden/>
+              </w:rPr>
+              <w:t>3</w:t>
+            </w:r>
+            <w:r>
+              <w:rPr>
+                <w:noProof/>
+                <w:webHidden/>
+                <w:rtl/>
+              </w:rPr>
+              <w:fldChar w:fldCharType="end"/>
+            </w:r>
+          </w:hyperlink>
+        </w:p>
+        <w:p>
+          <w:pPr>
+            <w:pStyle w:val="TOC1"/>
+            <w:tabs>
+              <w:tab w:val="right" w:leader="dot" w:pos="9016"/>
+            </w:tabs>
+            <w:bidi w:val="0"/>
+            <w:rPr>
+              <w:rFonts w:eastAsiaTheme="minorEastAsia"/>
+              <w:noProof/>
+              <w:rtl/>
+            </w:rPr>
+          </w:pPr>
+          <w:hyperlink w:anchor="_Toc227795085" w:history="1">
+            <w:r>
+              <w:rPr>
+                <w:rStyle w:val="Hyperlink"/>
+                <w:noProof/>
+              </w:rPr>
+              <w:t>Biconnected Components (Tarjan’s Algorithm):</w:t>
+            </w:r>
+            <w:r>
+              <w:rPr>
+                <w:noProof/>
+                <w:webHidden/>
+                <w:rtl/>
+              </w:rPr>
+              <w:tab/>
+            </w:r>
+            <w:r>
+              <w:rPr>
+                <w:noProof/>
+                <w:webHidden/>
+                <w:rtl/>
+              </w:rPr>
+              <w:fldChar w:fldCharType="begin"/>
+            </w:r>
+            <w:r>
+              <w:rPr>
+                <w:noProof/>
+                <w:webHidden/>
+                <w:rtl/>
+              </w:rPr>
+              <w:instrText xml:space="preserve"> </w:instrText>
+            </w:r>
+            <w:r>
+              <w:rPr>
+                <w:noProof/>
+                <w:webHidden/>
+              </w:rPr>
+              <w:instrText>PAGEREF</w:instrText>
+            </w:r>
+            <w:r>
+              <w:rPr>
+                <w:noProof/>
+                <w:webHidden/>
+                <w:rtl/>
+              </w:rPr>
+              <w:instrText xml:space="preserve"> _</w:instrText>
+            </w:r>
+            <w:r>
+              <w:rPr>
+                <w:noProof/>
+                <w:webHidden/>
+              </w:rPr>
+              <w:instrText>Toc227795085 \h</w:instrText>
+            </w:r>
+            <w:r>
+              <w:rPr>
+                <w:noProof/>
+                <w:webHidden/>
+                <w:rtl/>
+              </w:rPr>
+              <w:instrText xml:space="preserve"> </w:instrText>
+            </w:r>
+            <w:r>
+              <w:rPr>
+                <w:noProof/>
+                <w:webHidden/>
+                <w:rtl/>
+              </w:rPr>
+            </w:r>
+            <w:r>
+              <w:rPr>
+                <w:noProof/>
+                <w:webHidden/>
+                <w:rtl/>
+              </w:rPr>
+              <w:fldChar w:fldCharType="separate"/>
+            </w:r>
+            <w:r>
+              <w:rPr>
+                <w:noProof/>
+                <w:webHidden/>
+              </w:rPr>
+              <w:t>4</w:t>
+            </w:r>
+            <w:r>
+              <w:rPr>
+                <w:noProof/>
+                <w:webHidden/>
+                <w:rtl/>
+              </w:rPr>
+              <w:fldChar w:fldCharType="end"/>
+            </w:r>
+          </w:hyperlink>
+        </w:p>
+        <w:p>
+          <w:pPr>
+            <w:pStyle w:val="TOC1"/>
+            <w:tabs>
+              <w:tab w:val="right" w:leader="dot" w:pos="9016"/>
+            </w:tabs>
+            <w:bidi w:val="0"/>
+            <w:rPr>
+              <w:rFonts w:eastAsiaTheme="minorEastAsia"/>
+              <w:noProof/>
+              <w:rtl/>
+            </w:rPr>
+          </w:pPr>
+          <w:hyperlink w:anchor="_Toc227795086" w:history="1">
+            <w:r>
+              <w:rPr>
+                <w:rStyle w:val="Hyperlink"/>
+                <w:noProof/>
+              </w:rPr>
+              <w:t>Bridges (Tarjan’s Algorithm):</w:t>
+            </w:r>
+            <w:r>
+              <w:rPr>
+                <w:noProof/>
+                <w:webHidden/>
+                <w:rtl/>
+              </w:rPr>
+              <w:tab/>
+            </w:r>
+            <w:r>
+              <w:rPr>
+                <w:noProof/>
+                <w:webHidden/>
+                <w:rtl/>
+              </w:rPr>
+              <w:fldChar w:fldCharType="begin"/>
+            </w:r>
+            <w:r>
+              <w:rPr>
+                <w:noProof/>
+                <w:webHidden/>
+                <w:rtl/>
+              </w:rPr>
+              <w:instrText xml:space="preserve"> </w:instrText>
+            </w:r>
+            <w:r>
+              <w:rPr>
+                <w:noProof/>
+                <w:webHidden/>
+              </w:rPr>
+              <w:instrText>PAGEREF</w:instrText>
+            </w:r>
+            <w:r>
+              <w:rPr>
+                <w:noProof/>
+                <w:webHidden/>
+                <w:rtl/>
+              </w:rPr>
+              <w:instrText xml:space="preserve"> _</w:instrText>
+            </w:r>
+            <w:r>
+              <w:rPr>
+                <w:noProof/>
+                <w:webHidden/>
+              </w:rPr>
+              <w:instrText>Toc227795086 \h</w:instrText>
+            </w:r>
+            <w:r>
+              <w:rPr>
+                <w:noProof/>
+                <w:webHidden/>
+                <w:rtl/>
+              </w:rPr>
+              <w:instrText xml:space="preserve"> </w:instrText>
+            </w:r>
+            <w:r>
+              <w:rPr>
+                <w:noProof/>
+                <w:webHidden/>
+                <w:rtl/>
+              </w:rPr>
+            </w:r>
+            <w:r>
+              <w:rPr>
+                <w:noProof/>
+                <w:webHidden/>
+                <w:rtl/>
+              </w:rPr>
+              <w:fldChar w:fldCharType="separate"/>
+            </w:r>
+            <w:r>
+              <w:rPr>
+                <w:noProof/>
+                <w:webHidden/>
+              </w:rPr>
+              <w:t>5</w:t>
+            </w:r>
+            <w:r>
+              <w:rPr>
+                <w:noProof/>
+                <w:webHidden/>
+                <w:rtl/>
+              </w:rPr>
+              <w:fldChar w:fldCharType="end"/>
+            </w:r>
+          </w:hyperlink>
+        </w:p>
+        <w:p>
+          <w:pPr>
+            <w:pStyle w:val="TOC1"/>
+            <w:tabs>
+              <w:tab w:val="right" w:leader="dot" w:pos="9016"/>
+            </w:tabs>
+            <w:bidi w:val="0"/>
+            <w:rPr>
+              <w:rFonts w:eastAsiaTheme="minorEastAsia"/>
+              <w:noProof/>
+              <w:rtl/>
+            </w:rPr>
+          </w:pPr>
+          <w:hyperlink w:anchor="_Toc227795087" w:history="1">
+            <w:r>
+              <w:rPr>
+                <w:rStyle w:val="Hyperlink"/>
+                <w:noProof/>
+              </w:rPr>
+              <w:t>Flow (Dinic’s Algorithm):</w:t>
+            </w:r>
+            <w:r>
+              <w:rPr>
+                <w:noProof/>
+                <w:webHidden/>
+                <w:rtl/>
+              </w:rPr>
+              <w:tab/>
+            </w:r>
+            <w:r>
+              <w:rPr>
+                <w:noProof/>
+                <w:webHidden/>
+                <w:rtl/>
+              </w:rPr>
+              <w:fldChar w:fldCharType="begin"/>
+            </w:r>
+            <w:r>
+              <w:rPr>
+                <w:noProof/>
+                <w:webHidden/>
+                <w:rtl/>
+              </w:rPr>
+              <w:instrText xml:space="preserve"> </w:instrText>
+            </w:r>
+            <w:r>
+              <w:rPr>
+                <w:noProof/>
+                <w:webHidden/>
+              </w:rPr>
+              <w:instrText>PAGEREF</w:instrText>
+            </w:r>
+            <w:r>
+              <w:rPr>
+                <w:noProof/>
+                <w:webHidden/>
+                <w:rtl/>
+              </w:rPr>
+              <w:instrText xml:space="preserve"> _</w:instrText>
+            </w:r>
+            <w:r>
+              <w:rPr>
+                <w:noProof/>
+                <w:webHidden/>
+              </w:rPr>
+              <w:instrText>Toc227795087 \h</w:instrText>
+            </w:r>
+            <w:r>
+              <w:rPr>
+                <w:noProof/>
+                <w:webHidden/>
+                <w:rtl/>
+              </w:rPr>
+              <w:instrText xml:space="preserve"> </w:instrText>
+            </w:r>
+            <w:r>
+              <w:rPr>
+                <w:noProof/>
+                <w:webHidden/>
+                <w:rtl/>
+              </w:rPr>
+            </w:r>
+            <w:r>
+              <w:rPr>
+                <w:noProof/>
+                <w:webHidden/>
+                <w:rtl/>
+              </w:rPr>
+              <w:fldChar w:fldCharType="separate"/>
+            </w:r>
+            <w:r>
+              <w:rPr>
+                <w:noProof/>
+                <w:webHidden/>
+              </w:rPr>
+              <w:t>6</w:t>
+            </w:r>
+            <w:r>
+              <w:rPr>
+                <w:noProof/>
+                <w:webHidden/>
+                <w:rtl/>
+              </w:rPr>
+              <w:fldChar w:fldCharType="end"/>
+            </w:r>
+          </w:hyperlink>
+        </w:p>
+        <w:p>
+          <w:pPr>
+            <w:pStyle w:val="TOC1"/>
+            <w:tabs>
+              <w:tab w:val="right" w:leader="dot" w:pos="9016"/>
+            </w:tabs>
+            <w:bidi w:val="0"/>
+            <w:rPr>
+              <w:rFonts w:eastAsiaTheme="minorEastAsia"/>
+              <w:noProof/>
+              <w:rtl/>
+            </w:rPr>
+          </w:pPr>
+          <w:hyperlink w:anchor="_Toc227795088" w:history="1">
+            <w:r>
+              <w:rPr>
+                <w:rStyle w:val="Hyperlink"/>
+                <w:noProof/>
+              </w:rPr>
+              <w:t>LCA:</w:t>
+            </w:r>
+            <w:r>
+              <w:rPr>
+                <w:noProof/>
+                <w:webHidden/>
+                <w:rtl/>
+              </w:rPr>
+              <w:tab/>
+            </w:r>
+            <w:r>
+              <w:rPr>
+                <w:noProof/>
+                <w:webHidden/>
+                <w:rtl/>
+              </w:rPr>
+              <w:fldChar w:fldCharType="begin"/>
+            </w:r>
+            <w:r>
+              <w:rPr>
+                <w:noProof/>
+                <w:webHidden/>
+                <w:rtl/>
+              </w:rPr>
+              <w:instrText xml:space="preserve"> </w:instrText>
+            </w:r>
+            <w:r>
+              <w:rPr>
+                <w:noProof/>
+                <w:webHidden/>
+              </w:rPr>
+              <w:instrText>PAGEREF</w:instrText>
+            </w:r>
+            <w:r>
+              <w:rPr>
+                <w:noProof/>
+                <w:webHidden/>
+                <w:rtl/>
+              </w:rPr>
+              <w:instrText xml:space="preserve"> _</w:instrText>
+            </w:r>
+            <w:r>
+              <w:rPr>
+                <w:noProof/>
+                <w:webHidden/>
+              </w:rPr>
+              <w:instrText>Toc227795088 \h</w:instrText>
+            </w:r>
+            <w:r>
+              <w:rPr>
+                <w:noProof/>
+                <w:webHidden/>
+                <w:rtl/>
+              </w:rPr>
+              <w:instrText xml:space="preserve"> </w:instrText>
+            </w:r>
+            <w:r>
+              <w:rPr>
+                <w:noProof/>
+                <w:webHidden/>
+                <w:rtl/>
+              </w:rPr>
+            </w:r>
+            <w:r>
+              <w:rPr>
+                <w:noProof/>
+                <w:webHidden/>
+                <w:rtl/>
+              </w:rPr>
+              <w:fldChar w:fldCharType="separate"/>
+            </w:r>
+            <w:r>
+              <w:rPr>
+                <w:noProof/>
+                <w:webHidden/>
+              </w:rPr>
+              <w:t>8</w:t>
+            </w:r>
+            <w:r>
+              <w:rPr>
+                <w:noProof/>
+                <w:webHidden/>
+                <w:rtl/>
+              </w:rPr>
+              <w:fldChar w:fldCharType="end"/>
+            </w:r>
+          </w:hyperlink>
+        </w:p>
+        <w:p>
+          <w:pPr>
+            <w:pStyle w:val="TOC2"/>
+            <w:tabs>
+              <w:tab w:val="right" w:leader="dot" w:pos="9016"/>
+            </w:tabs>
+            <w:bidi w:val="0"/>
+            <w:rPr>
+              <w:rFonts w:eastAsiaTheme="minorEastAsia"/>
+              <w:noProof/>
+              <w:rtl/>
+            </w:rPr>
+          </w:pPr>
+          <w:hyperlink w:anchor="_Toc227795089" w:history="1">
+            <w:r>
+              <w:rPr>
+                <w:rStyle w:val="Hyperlink"/>
+                <w:noProof/>
+              </w:rPr>
+              <w:t>Binary Lifting:</w:t>
+            </w:r>
+            <w:r>
+              <w:rPr>
+                <w:noProof/>
+                <w:webHidden/>
+                <w:rtl/>
+              </w:rPr>
+              <w:tab/>
+            </w:r>
+            <w:r>
+              <w:rPr>
+                <w:noProof/>
+                <w:webHidden/>
+                <w:rtl/>
+              </w:rPr>
+              <w:fldChar w:fldCharType="begin"/>
+            </w:r>
+            <w:r>
+              <w:rPr>
+                <w:noProof/>
+                <w:webHidden/>
+                <w:rtl/>
+              </w:rPr>
+              <w:instrText xml:space="preserve"> </w:instrText>
+            </w:r>
+            <w:r>
+              <w:rPr>
+                <w:noProof/>
+                <w:webHidden/>
+              </w:rPr>
+              <w:instrText>PAGEREF</w:instrText>
+            </w:r>
+            <w:r>
+              <w:rPr>
+                <w:noProof/>
+                <w:webHidden/>
+                <w:rtl/>
+              </w:rPr>
+              <w:instrText xml:space="preserve"> _</w:instrText>
+            </w:r>
+            <w:r>
+              <w:rPr>
+                <w:noProof/>
+                <w:webHidden/>
+              </w:rPr>
+              <w:instrText>Toc227795089 \h</w:instrText>
+            </w:r>
+            <w:r>
+              <w:rPr>
+                <w:noProof/>
+                <w:webHidden/>
+                <w:rtl/>
+              </w:rPr>
+              <w:instrText xml:space="preserve"> </w:instrText>
+            </w:r>
+            <w:r>
+              <w:rPr>
+                <w:noProof/>
+                <w:webHidden/>
+                <w:rtl/>
+              </w:rPr>
+            </w:r>
+            <w:r>
+              <w:rPr>
+                <w:noProof/>
+                <w:webHidden/>
+                <w:rtl/>
+              </w:rPr>
+              <w:fldChar w:fldCharType="separate"/>
+            </w:r>
+            <w:r>
+              <w:rPr>
+                <w:noProof/>
+                <w:webHidden/>
+              </w:rPr>
+              <w:t>8</w:t>
+            </w:r>
+            <w:r>
+              <w:rPr>
+                <w:noProof/>
+                <w:webHidden/>
+                <w:rtl/>
+              </w:rPr>
+              <w:fldChar w:fldCharType="end"/>
+            </w:r>
+          </w:hyperlink>
+        </w:p>
+        <w:p>
+          <w:pPr>
+            <w:pStyle w:val="TOC2"/>
+            <w:tabs>
+              <w:tab w:val="right" w:leader="dot" w:pos="9016"/>
+            </w:tabs>
+            <w:bidi w:val="0"/>
+            <w:rPr>
+              <w:rFonts w:eastAsiaTheme="minorEastAsia"/>
+              <w:noProof/>
+              <w:rtl/>
+            </w:rPr>
+          </w:pPr>
+          <w:hyperlink w:anchor="_Toc227795090" w:history="1">
+            <w:r>
+              <w:rPr>
+                <w:rStyle w:val="Hyperlink"/>
+                <w:noProof/>
+              </w:rPr>
+              <w:t>Euler’s Tour 2:</w:t>
+            </w:r>
+            <w:r>
+              <w:rPr>
+                <w:noProof/>
+                <w:webHidden/>
+                <w:rtl/>
+              </w:rPr>
+              <w:tab/>
+            </w:r>
+            <w:r>
+              <w:rPr>
+                <w:noProof/>
+                <w:webHidden/>
+                <w:rtl/>
+              </w:rPr>
+              <w:fldChar w:fldCharType="begin"/>
+            </w:r>
+            <w:r>
+              <w:rPr>
+                <w:noProof/>
+                <w:webHidden/>
+                <w:rtl/>
+              </w:rPr>
+              <w:instrText xml:space="preserve"> </w:instrText>
+            </w:r>
+            <w:r>
+              <w:rPr>
+                <w:noProof/>
+                <w:webHidden/>
+              </w:rPr>
+              <w:instrText>PAGEREF</w:instrText>
+            </w:r>
+            <w:r>
+              <w:rPr>
+                <w:noProof/>
+                <w:webHidden/>
+                <w:rtl/>
+              </w:rPr>
+              <w:instrText xml:space="preserve"> _</w:instrText>
+            </w:r>
+            <w:r>
+              <w:rPr>
+                <w:noProof/>
+                <w:webHidden/>
+              </w:rPr>
+              <w:instrText>Toc227795090 \h</w:instrText>
+            </w:r>
+            <w:r>
+              <w:rPr>
+                <w:noProof/>
+                <w:webHidden/>
+                <w:rtl/>
+              </w:rPr>
+              <w:instrText xml:space="preserve"> </w:instrText>
+            </w:r>
+            <w:r>
+              <w:rPr>
+                <w:noProof/>
+                <w:webHidden/>
+                <w:rtl/>
+              </w:rPr>
+            </w:r>
+            <w:r>
+              <w:rPr>
+                <w:noProof/>
+                <w:webHidden/>
+                <w:rtl/>
+              </w:rPr>
+              <w:fldChar w:fldCharType="separate"/>
+            </w:r>
+            <w:r>
+              <w:rPr>
+                <w:noProof/>
+                <w:webHidden/>
+              </w:rPr>
+              <w:t>9</w:t>
+            </w:r>
+            <w:r>
+              <w:rPr>
+                <w:noProof/>
+                <w:webHidden/>
+                <w:rtl/>
+              </w:rPr>
+              <w:fldChar w:fldCharType="end"/>
+            </w:r>
+          </w:hyperlink>
+        </w:p>
+        <w:p>
+          <w:pPr>
+            <w:pStyle w:val="TOC1"/>
+            <w:tabs>
+              <w:tab w:val="right" w:leader="dot" w:pos="9016"/>
+            </w:tabs>
+            <w:bidi w:val="0"/>
+            <w:rPr>
+              <w:rFonts w:eastAsiaTheme="minorEastAsia"/>
+              <w:noProof/>
+              <w:rtl/>
+            </w:rPr>
+          </w:pPr>
+          <w:hyperlink w:anchor="_Toc227795091" w:history="1">
+            <w:r>
+              <w:rPr>
+                <w:rStyle w:val="Hyperlink"/>
+                <w:noProof/>
+              </w:rPr>
+              <w:t>Segment Tree On Tree (Euler’s Tour 3):</w:t>
+            </w:r>
+            <w:r>
+              <w:rPr>
+                <w:noProof/>
+                <w:webHidden/>
+                <w:rtl/>
+              </w:rPr>
+              <w:tab/>
+            </w:r>
+            <w:r>
+              <w:rPr>
+                <w:noProof/>
+                <w:webHidden/>
+                <w:rtl/>
+              </w:rPr>
+              <w:fldChar w:fldCharType="begin"/>
+            </w:r>
+            <w:r>
+              <w:rPr>
+                <w:noProof/>
+                <w:webHidden/>
+                <w:rtl/>
+              </w:rPr>
+              <w:instrText xml:space="preserve"> </w:instrText>
+            </w:r>
+            <w:r>
+              <w:rPr>
+                <w:noProof/>
+                <w:webHidden/>
+              </w:rPr>
+              <w:instrText>PAGEREF</w:instrText>
+            </w:r>
+            <w:r>
+              <w:rPr>
+                <w:noProof/>
+                <w:webHidden/>
+                <w:rtl/>
+              </w:rPr>
+              <w:instrText xml:space="preserve"> _</w:instrText>
+            </w:r>
+            <w:r>
+              <w:rPr>
+                <w:noProof/>
+                <w:webHidden/>
+              </w:rPr>
+              <w:instrText>Toc227795091 \h</w:instrText>
+            </w:r>
+            <w:r>
+              <w:rPr>
+                <w:noProof/>
+                <w:webHidden/>
+                <w:rtl/>
+              </w:rPr>
+              <w:instrText xml:space="preserve"> </w:instrText>
+            </w:r>
+            <w:r>
+              <w:rPr>
+                <w:noProof/>
+                <w:webHidden/>
+                <w:rtl/>
+              </w:rPr>
+            </w:r>
+            <w:r>
+              <w:rPr>
+                <w:noProof/>
+                <w:webHidden/>
+                <w:rtl/>
+              </w:rPr>
+              <w:fldChar w:fldCharType="separate"/>
+            </w:r>
+            <w:r>
+              <w:rPr>
+                <w:noProof/>
+                <w:webHidden/>
+              </w:rPr>
+              <w:t>11</w:t>
+            </w:r>
+            <w:r>
+              <w:rPr>
+                <w:noProof/>
+                <w:webHidden/>
+                <w:rtl/>
+              </w:rPr>
+              <w:fldChar w:fldCharType="end"/>
+            </w:r>
+          </w:hyperlink>
+        </w:p>
+        <w:p>
+          <w:pPr>
+            <w:pStyle w:val="TOC1"/>
+            <w:tabs>
+              <w:tab w:val="right" w:leader="dot" w:pos="9016"/>
+            </w:tabs>
+            <w:bidi w:val="0"/>
+            <w:rPr>
+              <w:rFonts w:eastAsiaTheme="minorEastAsia"/>
+              <w:noProof/>
+              <w:rtl/>
+            </w:rPr>
+          </w:pPr>
+          <w:hyperlink w:anchor="_Toc227795092" w:history="1">
+            <w:r>
+              <w:rPr>
+                <w:rStyle w:val="Hyperlink"/>
+                <w:noProof/>
+              </w:rPr>
+              <w:t>Shortest Path:</w:t>
+            </w:r>
+            <w:r>
+              <w:rPr>
+                <w:noProof/>
+                <w:webHidden/>
+                <w:rtl/>
+              </w:rPr>
+              <w:tab/>
+            </w:r>
+            <w:r>
+              <w:rPr>
+                <w:noProof/>
+                <w:webHidden/>
+                <w:rtl/>
+              </w:rPr>
+              <w:fldChar w:fldCharType="begin"/>
+            </w:r>
+            <w:r>
+              <w:rPr>
+                <w:noProof/>
+                <w:webHidden/>
+                <w:rtl/>
+              </w:rPr>
+              <w:instrText xml:space="preserve"> </w:instrText>
+            </w:r>
+            <w:r>
+              <w:rPr>
+                <w:noProof/>
+                <w:webHidden/>
+              </w:rPr>
+              <w:instrText>PAGEREF</w:instrText>
+            </w:r>
+            <w:r>
+              <w:rPr>
+                <w:noProof/>
+                <w:webHidden/>
+                <w:rtl/>
+              </w:rPr>
+              <w:instrText xml:space="preserve"> _</w:instrText>
+            </w:r>
+            <w:r>
+              <w:rPr>
+                <w:noProof/>
+                <w:webHidden/>
+              </w:rPr>
+              <w:instrText>Toc227795092 \h</w:instrText>
+            </w:r>
+            <w:r>
+              <w:rPr>
+                <w:noProof/>
+                <w:webHidden/>
+                <w:rtl/>
+              </w:rPr>
+              <w:instrText xml:space="preserve"> </w:instrText>
+            </w:r>
+            <w:r>
+              <w:rPr>
+                <w:noProof/>
+                <w:webHidden/>
+                <w:rtl/>
+              </w:rPr>
+            </w:r>
+            <w:r>
+              <w:rPr>
+                <w:noProof/>
+                <w:webHidden/>
+                <w:rtl/>
+              </w:rPr>
+              <w:fldChar w:fldCharType="separate"/>
+            </w:r>
+            <w:r>
+              <w:rPr>
+                <w:noProof/>
+                <w:webHidden/>
+              </w:rPr>
+              <w:t>12</w:t>
+            </w:r>
+            <w:r>
+              <w:rPr>
+                <w:noProof/>
+                <w:webHidden/>
+                <w:rtl/>
+              </w:rPr>
+              <w:fldChar w:fldCharType="end"/>
+            </w:r>
+          </w:hyperlink>
+        </w:p>
+        <w:p>
+          <w:pPr>
+            <w:pStyle w:val="TOC2"/>
+            <w:tabs>
+              <w:tab w:val="right" w:leader="dot" w:pos="9016"/>
+            </w:tabs>
+            <w:bidi w:val="0"/>
+            <w:rPr>
+              <w:rFonts w:eastAsiaTheme="minorEastAsia"/>
+              <w:noProof/>
+              <w:rtl/>
+            </w:rPr>
+          </w:pPr>
+          <w:hyperlink w:anchor="_Toc227795093" w:history="1">
+            <w:r>
+              <w:rPr>
+                <w:rStyle w:val="Hyperlink"/>
+                <w:noProof/>
+              </w:rPr>
+              <w:t>0-1 BFS:</w:t>
+            </w:r>
+            <w:r>
+              <w:rPr>
+                <w:noProof/>
+                <w:webHidden/>
+                <w:rtl/>
+              </w:rPr>
+              <w:tab/>
+            </w:r>
+            <w:r>
+              <w:rPr>
+                <w:noProof/>
+                <w:webHidden/>
+                <w:rtl/>
+              </w:rPr>
+              <w:fldChar w:fldCharType="begin"/>
+            </w:r>
+            <w:r>
+              <w:rPr>
+                <w:noProof/>
+                <w:webHidden/>
+                <w:rtl/>
+              </w:rPr>
+              <w:instrText xml:space="preserve"> </w:instrText>
+            </w:r>
+            <w:r>
+              <w:rPr>
+                <w:noProof/>
+                <w:webHidden/>
+              </w:rPr>
+              <w:instrText>PAGEREF</w:instrText>
+            </w:r>
+            <w:r>
+              <w:rPr>
+                <w:noProof/>
+                <w:webHidden/>
+                <w:rtl/>
+              </w:rPr>
+              <w:instrText xml:space="preserve"> _</w:instrText>
+            </w:r>
+            <w:r>
+              <w:rPr>
+                <w:noProof/>
+                <w:webHidden/>
+              </w:rPr>
+              <w:instrText>Toc227795093 \h</w:instrText>
+            </w:r>
+            <w:r>
+              <w:rPr>
+                <w:noProof/>
+                <w:webHidden/>
+                <w:rtl/>
+              </w:rPr>
+              <w:instrText xml:space="preserve"> </w:instrText>
+            </w:r>
+            <w:r>
+              <w:rPr>
+                <w:noProof/>
+                <w:webHidden/>
+                <w:rtl/>
+              </w:rPr>
+            </w:r>
+            <w:r>
+              <w:rPr>
+                <w:noProof/>
+                <w:webHidden/>
+                <w:rtl/>
+              </w:rPr>
+              <w:fldChar w:fldCharType="separate"/>
+            </w:r>
+            <w:r>
+              <w:rPr>
+                <w:noProof/>
+                <w:webHidden/>
+              </w:rPr>
+              <w:t>12</w:t>
+            </w:r>
+            <w:r>
+              <w:rPr>
+                <w:noProof/>
+                <w:webHidden/>
+                <w:rtl/>
+              </w:rPr>
+              <w:fldChar w:fldCharType="end"/>
+            </w:r>
+          </w:hyperlink>
+        </w:p>
+        <w:p>
+          <w:pPr>
+            <w:pStyle w:val="TOC2"/>
+            <w:tabs>
+              <w:tab w:val="right" w:leader="dot" w:pos="9016"/>
+            </w:tabs>
+            <w:bidi w:val="0"/>
+            <w:rPr>
+              <w:rFonts w:eastAsiaTheme="minorEastAsia"/>
+              <w:noProof/>
+              <w:rtl/>
+            </w:rPr>
+          </w:pPr>
+          <w:hyperlink w:anchor="_Toc227795094" w:history="1">
+            <w:r>
+              <w:rPr>
+                <w:rStyle w:val="Hyperlink"/>
+                <w:noProof/>
+              </w:rPr>
+              <w:t>Dijkstra’s Algorithm:</w:t>
+            </w:r>
+            <w:r>
+              <w:rPr>
+                <w:noProof/>
+                <w:webHidden/>
+                <w:rtl/>
+              </w:rPr>
+              <w:tab/>
+            </w:r>
+            <w:r>
+              <w:rPr>
+                <w:noProof/>
+                <w:webHidden/>
+                <w:rtl/>
+              </w:rPr>
+              <w:fldChar w:fldCharType="begin"/>
+            </w:r>
+            <w:r>
+              <w:rPr>
+                <w:noProof/>
+                <w:webHidden/>
+                <w:rtl/>
+              </w:rPr>
+              <w:instrText xml:space="preserve"> </w:instrText>
+            </w:r>
+            <w:r>
+              <w:rPr>
+                <w:noProof/>
+                <w:webHidden/>
+              </w:rPr>
+              <w:instrText>PAGEREF</w:instrText>
+            </w:r>
+            <w:r>
+              <w:rPr>
+                <w:noProof/>
+                <w:webHidden/>
+                <w:rtl/>
+              </w:rPr>
+              <w:instrText xml:space="preserve"> _</w:instrText>
+            </w:r>
+            <w:r>
+              <w:rPr>
+                <w:noProof/>
+                <w:webHidden/>
+              </w:rPr>
+              <w:instrText>Toc227795094 \h</w:instrText>
+            </w:r>
+            <w:r>
+              <w:rPr>
+                <w:noProof/>
+                <w:webHidden/>
+                <w:rtl/>
+              </w:rPr>
+              <w:instrText xml:space="preserve"> </w:instrText>
+            </w:r>
+            <w:r>
+              <w:rPr>
+                <w:noProof/>
+                <w:webHidden/>
+                <w:rtl/>
+              </w:rPr>
+            </w:r>
+            <w:r>
+              <w:rPr>
+                <w:noProof/>
+                <w:webHidden/>
+                <w:rtl/>
+              </w:rPr>
+              <w:fldChar w:fldCharType="separate"/>
+            </w:r>
+            <w:r>
+              <w:rPr>
+                <w:noProof/>
+                <w:webHidden/>
+              </w:rPr>
+              <w:t>13</w:t>
+            </w:r>
+            <w:r>
+              <w:rPr>
+                <w:noProof/>
+                <w:webHidden/>
+                <w:rtl/>
+              </w:rPr>
+              <w:fldChar w:fldCharType="end"/>
+            </w:r>
+          </w:hyperlink>
+        </w:p>
+        <w:p>
+          <w:pPr>
+            <w:pStyle w:val="TOC2"/>
+            <w:tabs>
+              <w:tab w:val="right" w:leader="dot" w:pos="9016"/>
+            </w:tabs>
+            <w:bidi w:val="0"/>
+            <w:rPr>
+              <w:rFonts w:eastAsiaTheme="minorEastAsia"/>
+              <w:noProof/>
+              <w:rtl/>
+            </w:rPr>
+          </w:pPr>
+          <w:hyperlink w:anchor="_Toc227795095" w:history="1">
+            <w:r>
+              <w:rPr>
+                <w:rStyle w:val="Hyperlink"/>
+                <w:noProof/>
+              </w:rPr>
+              <w:t>Bellman Ford’s Algorithm:</w:t>
+            </w:r>
+            <w:r>
+              <w:rPr>
+                <w:noProof/>
+                <w:webHidden/>
+                <w:rtl/>
+              </w:rPr>
+              <w:tab/>
+            </w:r>
+            <w:r>
+              <w:rPr>
+                <w:noProof/>
+                <w:webHidden/>
+                <w:rtl/>
+              </w:rPr>
+              <w:fldChar w:fldCharType="begin"/>
+            </w:r>
+            <w:r>
+              <w:rPr>
+                <w:noProof/>
+                <w:webHidden/>
+                <w:rtl/>
+              </w:rPr>
+              <w:instrText xml:space="preserve"> </w:instrText>
+            </w:r>
+            <w:r>
+              <w:rPr>
+                <w:noProof/>
+                <w:webHidden/>
+              </w:rPr>
+              <w:instrText>PAGEREF</w:instrText>
+            </w:r>
+            <w:r>
+              <w:rPr>
+                <w:noProof/>
+                <w:webHidden/>
+                <w:rtl/>
+              </w:rPr>
+              <w:instrText xml:space="preserve"> _</w:instrText>
+            </w:r>
+            <w:r>
+              <w:rPr>
+                <w:noProof/>
+                <w:webHidden/>
+              </w:rPr>
+              <w:instrText>Toc227795095 \h</w:instrText>
+            </w:r>
+            <w:r>
+              <w:rPr>
+                <w:noProof/>
+                <w:webHidden/>
+                <w:rtl/>
+              </w:rPr>
+              <w:instrText xml:space="preserve"> </w:instrText>
+            </w:r>
+            <w:r>
+              <w:rPr>
+                <w:noProof/>
+                <w:webHidden/>
+                <w:rtl/>
+              </w:rPr>
+            </w:r>
+            <w:r>
+              <w:rPr>
+                <w:noProof/>
+                <w:webHidden/>
+                <w:rtl/>
+              </w:rPr>
+              <w:fldChar w:fldCharType="separate"/>
+            </w:r>
+            <w:r>
+              <w:rPr>
+                <w:noProof/>
+                <w:webHidden/>
+              </w:rPr>
+              <w:t>14</w:t>
+            </w:r>
+            <w:r>
+              <w:rPr>
+                <w:noProof/>
+                <w:webHidden/>
+                <w:rtl/>
+              </w:rPr>
+              <w:fldChar w:fldCharType="end"/>
+            </w:r>
+          </w:hyperlink>
+        </w:p>
+        <w:p>
+          <w:pPr>
+            <w:pStyle w:val="TOC2"/>
+            <w:tabs>
+              <w:tab w:val="right" w:leader="dot" w:pos="9016"/>
+            </w:tabs>
+            <w:bidi w:val="0"/>
+            <w:rPr>
+              <w:rFonts w:eastAsiaTheme="minorEastAsia"/>
+              <w:noProof/>
+              <w:rtl/>
+            </w:rPr>
+          </w:pPr>
+          <w:hyperlink w:anchor="_Toc227795096" w:history="1">
+            <w:r>
+              <w:rPr>
+                <w:rStyle w:val="Hyperlink"/>
+                <w:noProof/>
+              </w:rPr>
+              <w:t>Floyd Warshall’s Algorithm:</w:t>
+            </w:r>
+            <w:r>
+              <w:rPr>
+                <w:noProof/>
+                <w:webHidden/>
+                <w:rtl/>
+              </w:rPr>
+              <w:tab/>
+            </w:r>
+            <w:r>
+              <w:rPr>
+                <w:noProof/>
+                <w:webHidden/>
+                <w:rtl/>
+              </w:rPr>
+              <w:fldChar w:fldCharType="begin"/>
+            </w:r>
+            <w:r>
+              <w:rPr>
+                <w:noProof/>
+                <w:webHidden/>
+                <w:rtl/>
+              </w:rPr>
+              <w:instrText xml:space="preserve"> </w:instrText>
+            </w:r>
+            <w:r>
+              <w:rPr>
+                <w:noProof/>
+                <w:webHidden/>
+              </w:rPr>
+              <w:instrText>PAGEREF</w:instrText>
+            </w:r>
+            <w:r>
+              <w:rPr>
+                <w:noProof/>
+                <w:webHidden/>
+                <w:rtl/>
+              </w:rPr>
+              <w:instrText xml:space="preserve"> _</w:instrText>
+            </w:r>
+            <w:r>
+              <w:rPr>
+                <w:noProof/>
+                <w:webHidden/>
+              </w:rPr>
+              <w:instrText>Toc227795096 \h</w:instrText>
+            </w:r>
+            <w:r>
+              <w:rPr>
+                <w:noProof/>
+                <w:webHidden/>
+                <w:rtl/>
+              </w:rPr>
+              <w:instrText xml:space="preserve"> </w:instrText>
+            </w:r>
+            <w:r>
+              <w:rPr>
+                <w:noProof/>
+                <w:webHidden/>
+                <w:rtl/>
+              </w:rPr>
+            </w:r>
+            <w:r>
+              <w:rPr>
+                <w:noProof/>
+                <w:webHidden/>
+                <w:rtl/>
+              </w:rPr>
+              <w:fldChar w:fldCharType="separate"/>
+            </w:r>
+            <w:r>
+              <w:rPr>
+                <w:noProof/>
+                <w:webHidden/>
+              </w:rPr>
+              <w:t>15</w:t>
+            </w:r>
+            <w:r>
+              <w:rPr>
+                <w:noProof/>
+                <w:webHidden/>
+                <w:rtl/>
+              </w:rPr>
+              <w:fldChar w:fldCharType="end"/>
+            </w:r>
+          </w:hyperlink>
+        </w:p>
+        <w:p>
+          <w:pPr>
+            <w:pStyle w:val="TOC1"/>
+            <w:tabs>
+              <w:tab w:val="right" w:leader="dot" w:pos="9016"/>
+            </w:tabs>
+            <w:bidi w:val="0"/>
+            <w:rPr>
+              <w:rFonts w:eastAsiaTheme="minorEastAsia"/>
+              <w:noProof/>
+              <w:rtl/>
+            </w:rPr>
+          </w:pPr>
+          <w:hyperlink w:anchor="_Toc227795097" w:history="1">
+            <w:r>
+              <w:rPr>
+                <w:rStyle w:val="Hyperlink"/>
+                <w:noProof/>
+              </w:rPr>
+              <w:t>Spanning Tree (Kruskal’s Algorithm):</w:t>
+            </w:r>
+            <w:r>
+              <w:rPr>
+                <w:noProof/>
+                <w:webHidden/>
+                <w:rtl/>
+              </w:rPr>
+              <w:tab/>
+            </w:r>
+            <w:r>
+              <w:rPr>
+                <w:noProof/>
+                <w:webHidden/>
+                <w:rtl/>
+              </w:rPr>
+              <w:fldChar w:fldCharType="begin"/>
+            </w:r>
+            <w:r>
+              <w:rPr>
+                <w:noProof/>
+                <w:webHidden/>
+                <w:rtl/>
+              </w:rPr>
+              <w:instrText xml:space="preserve"> </w:instrText>
+            </w:r>
+            <w:r>
+              <w:rPr>
+                <w:noProof/>
+                <w:webHidden/>
+              </w:rPr>
+              <w:instrText>PAGEREF</w:instrText>
+            </w:r>
+            <w:r>
+              <w:rPr>
+                <w:noProof/>
+                <w:webHidden/>
+                <w:rtl/>
+              </w:rPr>
+              <w:instrText xml:space="preserve"> _</w:instrText>
+            </w:r>
+            <w:r>
+              <w:rPr>
+                <w:noProof/>
+                <w:webHidden/>
+              </w:rPr>
+              <w:instrText>Toc227795097 \h</w:instrText>
+            </w:r>
+            <w:r>
+              <w:rPr>
+                <w:noProof/>
+                <w:webHidden/>
+                <w:rtl/>
+              </w:rPr>
+              <w:instrText xml:space="preserve"> </w:instrText>
+            </w:r>
+            <w:r>
+              <w:rPr>
+                <w:noProof/>
+                <w:webHidden/>
+                <w:rtl/>
+              </w:rPr>
+            </w:r>
+            <w:r>
+              <w:rPr>
+                <w:noProof/>
+                <w:webHidden/>
+                <w:rtl/>
+              </w:rPr>
+              <w:fldChar w:fldCharType="separate"/>
+            </w:r>
+            <w:r>
+              <w:rPr>
+                <w:noProof/>
+                <w:webHidden/>
+              </w:rPr>
+              <w:t>16</w:t>
+            </w:r>
+            <w:r>
+              <w:rPr>
+                <w:noProof/>
+                <w:webHidden/>
+                <w:rtl/>
+              </w:rPr>
+              <w:fldChar w:fldCharType="end"/>
+            </w:r>
+          </w:hyperlink>
+        </w:p>
+        <w:p>
+          <w:pPr>
+            <w:pStyle w:val="TOC1"/>
+            <w:tabs>
+              <w:tab w:val="right" w:leader="dot" w:pos="9016"/>
+            </w:tabs>
+            <w:bidi w:val="0"/>
+            <w:rPr>
+              <w:rFonts w:eastAsiaTheme="minorEastAsia"/>
+              <w:noProof/>
+              <w:rtl/>
+            </w:rPr>
+          </w:pPr>
+          <w:hyperlink w:anchor="_Toc227795098" w:history="1">
+            <w:r>
+              <w:rPr>
+                <w:rStyle w:val="Hyperlink"/>
+                <w:noProof/>
+              </w:rPr>
+              <w:t>Strongly Connected Components (Tarjan’s Algorithm):</w:t>
+            </w:r>
+            <w:r>
+              <w:rPr>
+                <w:noProof/>
+                <w:webHidden/>
+                <w:rtl/>
+              </w:rPr>
+              <w:tab/>
+            </w:r>
+            <w:r>
+              <w:rPr>
+                <w:noProof/>
+                <w:webHidden/>
+                <w:rtl/>
+              </w:rPr>
+              <w:fldChar w:fldCharType="begin"/>
+            </w:r>
+            <w:r>
+              <w:rPr>
+                <w:noProof/>
+                <w:webHidden/>
+                <w:rtl/>
+              </w:rPr>
+              <w:instrText xml:space="preserve"> </w:instrText>
+            </w:r>
+            <w:r>
+              <w:rPr>
+                <w:noProof/>
+                <w:webHidden/>
+              </w:rPr>
+              <w:instrText>PAGEREF</w:instrText>
+            </w:r>
+            <w:r>
+              <w:rPr>
+                <w:noProof/>
+                <w:webHidden/>
+                <w:rtl/>
+              </w:rPr>
+              <w:instrText xml:space="preserve"> _</w:instrText>
+            </w:r>
+            <w:r>
+              <w:rPr>
+                <w:noProof/>
+                <w:webHidden/>
+              </w:rPr>
+              <w:instrText>Toc227795098 \h</w:instrText>
+            </w:r>
+            <w:r>
+              <w:rPr>
+                <w:noProof/>
+                <w:webHidden/>
+                <w:rtl/>
+              </w:rPr>
+              <w:instrText xml:space="preserve"> </w:instrText>
+            </w:r>
+            <w:r>
+              <w:rPr>
+                <w:noProof/>
+                <w:webHidden/>
+                <w:rtl/>
+              </w:rPr>
+            </w:r>
+            <w:r>
+              <w:rPr>
+                <w:noProof/>
+                <w:webHidden/>
+                <w:rtl/>
+              </w:rPr>
+              <w:fldChar w:fldCharType="separate"/>
+            </w:r>
+            <w:r>
+              <w:rPr>
+                <w:noProof/>
+                <w:webHidden/>
+              </w:rPr>
+              <w:t>17</w:t>
+            </w:r>
+            <w:r>
+              <w:rPr>
+                <w:noProof/>
+                <w:webHidden/>
+                <w:rtl/>
+              </w:rPr>
+              <w:fldChar w:fldCharType="end"/>
+            </w:r>
+          </w:hyperlink>
+        </w:p>
+        <w:p>
+          <w:pPr>
+            <w:bidi w:val="0"/>
+          </w:pPr>
+          <w:r>
+            <w:rPr>
+              <w:b/>
+              <w:bCs/>
+              <w:noProof/>
+            </w:rPr>
+            <w:fldChar w:fldCharType="end"/>
+          </w:r>
+        </w:p>
+      </w:sdtContent>
+    </w:sdt>
     <w:p>
       <w:pPr>
         <w:bidi w:val="0"/>
@@ -215,122 +1874,15 @@
     </w:p>
     <w:p>
       <w:pPr>
-        <w:bidi w:val="0"/>
-        <w:rPr>
-          <w:b/>
-          <w:bCs/>
-          <w:color w:val="EE0000"/>
-          <w:sz w:val="60"/>
-          <w:szCs w:val="60"/>
-        </w:rPr>
-      </w:pPr>
-    </w:p>
-    <w:p>
-      <w:pPr>
-        <w:bidi w:val="0"/>
-        <w:rPr>
-          <w:b/>
-          <w:bCs/>
-          <w:color w:val="EE0000"/>
-          <w:sz w:val="60"/>
-          <w:szCs w:val="60"/>
-        </w:rPr>
-      </w:pPr>
-    </w:p>
-    <w:p>
-      <w:pPr>
-        <w:bidi w:val="0"/>
-        <w:rPr>
-          <w:b/>
-          <w:bCs/>
-          <w:color w:val="EE0000"/>
-          <w:sz w:val="60"/>
-          <w:szCs w:val="60"/>
-        </w:rPr>
-      </w:pPr>
-    </w:p>
-    <w:p>
-      <w:pPr>
-        <w:bidi w:val="0"/>
-        <w:rPr>
-          <w:b/>
-          <w:bCs/>
-          <w:color w:val="EE0000"/>
-          <w:sz w:val="60"/>
-          <w:szCs w:val="60"/>
-        </w:rPr>
-      </w:pPr>
-    </w:p>
-    <w:p>
-      <w:pPr>
-        <w:bidi w:val="0"/>
-        <w:rPr>
-          <w:b/>
-          <w:bCs/>
-          <w:color w:val="EE0000"/>
-          <w:sz w:val="60"/>
-          <w:szCs w:val="60"/>
-        </w:rPr>
-      </w:pPr>
-    </w:p>
-    <w:p>
-      <w:pPr>
-        <w:bidi w:val="0"/>
-        <w:rPr>
-          <w:b/>
-          <w:bCs/>
-          <w:color w:val="EE0000"/>
-          <w:sz w:val="60"/>
-          <w:szCs w:val="60"/>
-        </w:rPr>
-      </w:pPr>
-    </w:p>
-    <w:p>
-      <w:pPr>
-        <w:bidi w:val="0"/>
-        <w:rPr>
-          <w:b/>
-          <w:bCs/>
-          <w:color w:val="EE0000"/>
-          <w:sz w:val="60"/>
-          <w:szCs w:val="60"/>
-        </w:rPr>
-      </w:pPr>
-    </w:p>
-    <w:p>
-      <w:pPr>
-        <w:bidi w:val="0"/>
-        <w:rPr>
-          <w:b/>
-          <w:bCs/>
-          <w:color w:val="EE0000"/>
-          <w:sz w:val="60"/>
-          <w:szCs w:val="60"/>
-        </w:rPr>
-      </w:pPr>
-    </w:p>
-    <w:p>
-      <w:pPr>
-        <w:bidi w:val="0"/>
-        <w:rPr>
-          <w:b/>
-          <w:bCs/>
-          <w:color w:val="EE0000"/>
-          <w:sz w:val="40"/>
-          <w:szCs w:val="40"/>
-        </w:rPr>
-      </w:pPr>
-      <w:r>
-        <w:rPr>
-          <w:b/>
-          <w:bCs/>
-          <w:color w:val="EE0000"/>
-          <w:sz w:val="40"/>
-          <w:szCs w:val="40"/>
-        </w:rPr>
+        <w:pStyle w:val="Heading1"/>
+        <w:bidi w:val="0"/>
+      </w:pPr>
+      <w:bookmarkStart w:id="0" w:name="_Toc227795084"/>
+      <w:r>
         <w:lastRenderedPageBreak/>
         <w:t>Articulation Points (Tarjan’s Algorithm):</w:t>
       </w:r>
+      <w:bookmarkEnd w:id="0"/>
     </w:p>
     <w:p>
       <w:pPr>
@@ -366,7 +1918,7 @@
                     <pic:cNvPicPr/>
                   </pic:nvPicPr>
                   <pic:blipFill>
-                    <a:blip r:embed="rId7" cstate="print">
+                    <a:blip r:embed="rId8" cstate="print">
                       <a:extLst>
                         <a:ext uri="{28A0092B-C50C-407E-A947-70E740481C1C}">
                           <a14:useLocalDpi xmlns:a14="http://schemas.microsoft.com/office/drawing/2010/main" val="0"/>
@@ -395,36 +1947,18 @@
     </w:p>
     <w:p>
       <w:pPr>
-        <w:bidi w:val="0"/>
-        <w:rPr>
-          <w:b/>
-          <w:bCs/>
-          <w:color w:val="EE0000"/>
-          <w:sz w:val="40"/>
-          <w:szCs w:val="40"/>
-        </w:rPr>
-      </w:pPr>
-      <w:r>
-        <w:rPr>
-          <w:b/>
-          <w:bCs/>
-          <w:color w:val="EE0000"/>
-          <w:sz w:val="40"/>
-          <w:szCs w:val="40"/>
-        </w:rPr>
+        <w:pStyle w:val="Heading1"/>
+        <w:bidi w:val="0"/>
+      </w:pPr>
+      <w:bookmarkStart w:id="1" w:name="_Toc227795085"/>
+      <w:r>
         <w:lastRenderedPageBreak/>
         <w:t>Biconnected Components</w:t>
       </w:r>
       <w:r>
-        <w:rPr>
-          <w:b/>
-          <w:bCs/>
-          <w:color w:val="EE0000"/>
-          <w:sz w:val="40"/>
-          <w:szCs w:val="40"/>
-        </w:rPr>
         <w:t xml:space="preserve"> (Tarjan’s Algorithm):</w:t>
       </w:r>
+      <w:bookmarkEnd w:id="1"/>
     </w:p>
     <w:p>
       <w:pPr>
@@ -468,7 +2002,7 @@
                     <pic:cNvPicPr/>
                   </pic:nvPicPr>
                   <pic:blipFill>
-                    <a:blip r:embed="rId8" cstate="print">
+                    <a:blip r:embed="rId9" cstate="print">
                       <a:extLst>
                         <a:ext uri="{28A0092B-C50C-407E-A947-70E740481C1C}">
                           <a14:useLocalDpi xmlns:a14="http://schemas.microsoft.com/office/drawing/2010/main" val="0"/>
@@ -497,36 +2031,18 @@
     </w:p>
     <w:p>
       <w:pPr>
-        <w:bidi w:val="0"/>
-        <w:rPr>
-          <w:b/>
-          <w:bCs/>
-          <w:color w:val="EE0000"/>
-          <w:sz w:val="40"/>
-          <w:szCs w:val="40"/>
-        </w:rPr>
-      </w:pPr>
-      <w:r>
-        <w:rPr>
-          <w:b/>
-          <w:bCs/>
-          <w:color w:val="EE0000"/>
-          <w:sz w:val="40"/>
-          <w:szCs w:val="40"/>
-        </w:rPr>
+        <w:pStyle w:val="Heading1"/>
+        <w:bidi w:val="0"/>
+      </w:pPr>
+      <w:bookmarkStart w:id="2" w:name="_Toc227795086"/>
+      <w:r>
         <w:lastRenderedPageBreak/>
         <w:t>Bridges</w:t>
       </w:r>
       <w:r>
-        <w:rPr>
-          <w:b/>
-          <w:bCs/>
-          <w:color w:val="EE0000"/>
-          <w:sz w:val="40"/>
-          <w:szCs w:val="40"/>
-        </w:rPr>
         <w:t xml:space="preserve"> (Tarjan’s Algorithm):</w:t>
       </w:r>
+      <w:bookmarkEnd w:id="2"/>
     </w:p>
     <w:p>
       <w:pPr>
@@ -570,7 +2086,7 @@
                     <pic:cNvPicPr/>
                   </pic:nvPicPr>
                   <pic:blipFill>
-                    <a:blip r:embed="rId9" cstate="print">
+                    <a:blip r:embed="rId10" cstate="print">
                       <a:extLst>
                         <a:ext uri="{28A0092B-C50C-407E-A947-70E740481C1C}">
                           <a14:useLocalDpi xmlns:a14="http://schemas.microsoft.com/office/drawing/2010/main" val="0"/>
@@ -653,68 +2169,29 @@
     </w:p>
     <w:p>
       <w:pPr>
-        <w:bidi w:val="0"/>
-        <w:rPr>
-          <w:b/>
-          <w:bCs/>
-          <w:color w:val="EE0000"/>
-          <w:sz w:val="40"/>
-          <w:szCs w:val="40"/>
-        </w:rPr>
-      </w:pPr>
-      <w:r>
-        <w:rPr>
-          <w:b/>
-          <w:bCs/>
-          <w:color w:val="EE0000"/>
-          <w:sz w:val="40"/>
-          <w:szCs w:val="40"/>
-        </w:rPr>
+        <w:pStyle w:val="Heading1"/>
+        <w:bidi w:val="0"/>
+      </w:pPr>
+      <w:bookmarkStart w:id="3" w:name="_Toc227795087"/>
+      <w:r>
         <w:lastRenderedPageBreak/>
         <w:t>Flow</w:t>
       </w:r>
       <w:r>
-        <w:rPr>
-          <w:b/>
-          <w:bCs/>
-          <w:color w:val="EE0000"/>
-          <w:sz w:val="40"/>
-          <w:szCs w:val="40"/>
-        </w:rPr>
         <w:t xml:space="preserve"> (</w:t>
       </w:r>
       <w:proofErr w:type="spellStart"/>
       <w:r>
-        <w:rPr>
-          <w:b/>
-          <w:bCs/>
-          <w:color w:val="EE0000"/>
-          <w:sz w:val="40"/>
-          <w:szCs w:val="40"/>
-        </w:rPr>
         <w:t>Dinic’s</w:t>
       </w:r>
       <w:proofErr w:type="spellEnd"/>
       <w:r>
-        <w:rPr>
-          <w:b/>
-          <w:bCs/>
-          <w:color w:val="EE0000"/>
-          <w:sz w:val="40"/>
-          <w:szCs w:val="40"/>
-        </w:rPr>
         <w:t xml:space="preserve"> Algorithm)</w:t>
       </w:r>
       <w:r>
-        <w:rPr>
-          <w:b/>
-          <w:bCs/>
-          <w:color w:val="EE0000"/>
-          <w:sz w:val="40"/>
-          <w:szCs w:val="40"/>
-        </w:rPr>
         <w:t>:</w:t>
       </w:r>
+      <w:bookmarkEnd w:id="3"/>
     </w:p>
     <w:p>
       <w:pPr>
@@ -753,7 +2230,7 @@
                     <pic:cNvPicPr/>
                   </pic:nvPicPr>
                   <pic:blipFill>
-                    <a:blip r:embed="rId10">
+                    <a:blip r:embed="rId11">
                       <a:extLst>
                         <a:ext uri="{28A0092B-C50C-407E-A947-70E740481C1C}">
                           <a14:useLocalDpi xmlns:a14="http://schemas.microsoft.com/office/drawing/2010/main" val="0"/>
@@ -818,7 +2295,7 @@
                     <pic:cNvPicPr/>
                   </pic:nvPicPr>
                   <pic:blipFill>
-                    <a:blip r:embed="rId11" cstate="print">
+                    <a:blip r:embed="rId12" cstate="print">
                       <a:extLst>
                         <a:ext uri="{28A0092B-C50C-407E-A947-70E740481C1C}">
                           <a14:useLocalDpi xmlns:a14="http://schemas.microsoft.com/office/drawing/2010/main" val="0"/>
@@ -847,56 +2324,29 @@
     </w:p>
     <w:p>
       <w:pPr>
-        <w:bidi w:val="0"/>
-        <w:rPr>
-          <w:b/>
-          <w:bCs/>
-          <w:color w:val="EE0000"/>
-          <w:sz w:val="40"/>
-          <w:szCs w:val="40"/>
-        </w:rPr>
-      </w:pPr>
-      <w:r>
-        <w:rPr>
-          <w:b/>
-          <w:bCs/>
-          <w:color w:val="EE0000"/>
-          <w:sz w:val="40"/>
-          <w:szCs w:val="40"/>
-        </w:rPr>
+        <w:pStyle w:val="Heading1"/>
+        <w:bidi w:val="0"/>
+      </w:pPr>
+      <w:bookmarkStart w:id="4" w:name="_Toc227795088"/>
+      <w:r>
         <w:lastRenderedPageBreak/>
-        <w:t>LCA</w:t>
-      </w:r>
-      <w:r>
-        <w:rPr>
-          <w:b/>
-          <w:bCs/>
-          <w:color w:val="EE0000"/>
-          <w:sz w:val="40"/>
-          <w:szCs w:val="40"/>
-        </w:rPr>
-        <w:t xml:space="preserve"> (</w:t>
-      </w:r>
-      <w:r>
-        <w:rPr>
-          <w:b/>
-          <w:bCs/>
-          <w:color w:val="EE0000"/>
-          <w:sz w:val="40"/>
-          <w:szCs w:val="40"/>
-        </w:rPr>
+        <w:t>LCA:</w:t>
+      </w:r>
+      <w:bookmarkEnd w:id="4"/>
+    </w:p>
+    <w:p>
+      <w:pPr>
+        <w:pStyle w:val="Heading2"/>
+        <w:bidi w:val="0"/>
+      </w:pPr>
+      <w:bookmarkStart w:id="5" w:name="_Toc227795089"/>
+      <w:r>
         <w:t>Binary Lifting</w:t>
       </w:r>
       <w:r>
-        <w:rPr>
-          <w:b/>
-          <w:bCs/>
-          <w:color w:val="EE0000"/>
-          <w:sz w:val="40"/>
-          <w:szCs w:val="40"/>
-        </w:rPr>
-        <w:t>):</w:t>
-      </w:r>
+        <w:t>:</w:t>
+      </w:r>
+      <w:bookmarkEnd w:id="5"/>
     </w:p>
     <w:p>
       <w:pPr>
@@ -920,8 +2370,8 @@
           <w:szCs w:val="40"/>
         </w:rPr>
         <w:drawing>
-          <wp:inline distT="0" distB="0" distL="0" distR="0" wp14:anchorId="70C912C9" wp14:editId="6458A619">
-            <wp:extent cx="4347541" cy="8005313"/>
+          <wp:inline distT="0" distB="0" distL="0" distR="0" wp14:anchorId="70C912C9" wp14:editId="35D1F49A">
+            <wp:extent cx="4346886" cy="7591245"/>
             <wp:effectExtent l="0" t="0" r="0" b="0"/>
             <wp:docPr id="1036055985" name="Picture 15"/>
             <wp:cNvGraphicFramePr>
@@ -935,7 +2385,7 @@
                     <pic:cNvPicPr/>
                   </pic:nvPicPr>
                   <pic:blipFill>
-                    <a:blip r:embed="rId12" cstate="print">
+                    <a:blip r:embed="rId13" cstate="print">
                       <a:extLst>
                         <a:ext uri="{28A0092B-C50C-407E-A947-70E740481C1C}">
                           <a14:useLocalDpi xmlns:a14="http://schemas.microsoft.com/office/drawing/2010/main" val="0"/>
@@ -949,7 +2399,7 @@
                   <pic:spPr>
                     <a:xfrm>
                       <a:off x="0" y="0"/>
-                      <a:ext cx="4347541" cy="8005313"/>
+                      <a:ext cx="4353561" cy="7602903"/>
                     </a:xfrm>
                     <a:prstGeom prst="rect">
                       <a:avLst/>
@@ -974,56 +2424,18 @@
     </w:p>
     <w:p>
       <w:pPr>
-        <w:bidi w:val="0"/>
-        <w:rPr>
-          <w:b/>
-          <w:bCs/>
-          <w:color w:val="EE0000"/>
-          <w:sz w:val="40"/>
-          <w:szCs w:val="40"/>
-        </w:rPr>
-      </w:pPr>
-      <w:r>
-        <w:rPr>
-          <w:b/>
-          <w:bCs/>
-          <w:color w:val="EE0000"/>
-          <w:sz w:val="40"/>
-          <w:szCs w:val="40"/>
-        </w:rPr>
+        <w:pStyle w:val="Heading2"/>
+        <w:bidi w:val="0"/>
+      </w:pPr>
+      <w:bookmarkStart w:id="6" w:name="_Toc227795090"/>
+      <w:r>
         <w:lastRenderedPageBreak/>
-        <w:t>LCA</w:t>
-      </w:r>
-      <w:r>
-        <w:rPr>
-          <w:b/>
-          <w:bCs/>
-          <w:color w:val="EE0000"/>
-          <w:sz w:val="40"/>
-          <w:szCs w:val="40"/>
-        </w:rPr>
-        <w:t xml:space="preserve"> (</w:t>
-      </w:r>
-      <w:r>
-        <w:rPr>
-          <w:b/>
-          <w:bCs/>
-          <w:color w:val="EE0000"/>
-          <w:sz w:val="40"/>
-          <w:szCs w:val="40"/>
-        </w:rPr>
         <w:t>Euler’s Tour 2</w:t>
       </w:r>
       <w:r>
-        <w:rPr>
-          <w:b/>
-          <w:bCs/>
-          <w:color w:val="EE0000"/>
-          <w:sz w:val="40"/>
-          <w:szCs w:val="40"/>
-        </w:rPr>
-        <w:t>):</w:t>
-      </w:r>
+        <w:t>:</w:t>
+      </w:r>
+      <w:bookmarkEnd w:id="6"/>
     </w:p>
     <w:p>
       <w:pPr>
@@ -1067,7 +2479,7 @@
                     <pic:cNvPicPr/>
                   </pic:nvPicPr>
                   <pic:blipFill>
-                    <a:blip r:embed="rId13" cstate="print">
+                    <a:blip r:embed="rId14" cstate="print">
                       <a:extLst>
                         <a:ext uri="{28A0092B-C50C-407E-A947-70E740481C1C}">
                           <a14:useLocalDpi xmlns:a14="http://schemas.microsoft.com/office/drawing/2010/main" val="0"/>
@@ -1137,7 +2549,7 @@
                     <pic:cNvPicPr/>
                   </pic:nvPicPr>
                   <pic:blipFill>
-                    <a:blip r:embed="rId14" cstate="print">
+                    <a:blip r:embed="rId15" cstate="print">
                       <a:extLst>
                         <a:ext uri="{28A0092B-C50C-407E-A947-70E740481C1C}">
                           <a14:useLocalDpi xmlns:a14="http://schemas.microsoft.com/office/drawing/2010/main" val="0"/>
@@ -1166,83 +2578,27 @@
     </w:p>
     <w:p>
       <w:pPr>
-        <w:autoSpaceDE w:val="0"/>
-        <w:autoSpaceDN w:val="0"/>
-        <w:bidi w:val="0"/>
-        <w:adjustRightInd w:val="0"/>
-        <w:spacing w:after="0" w:line="240" w:lineRule="auto"/>
-        <w:jc w:val="center"/>
-        <w:rPr>
-          <w:rFonts w:ascii="Cascadia Mono" w:hAnsi="Cascadia Mono" w:cs="Cascadia Mono"/>
-          <w:color w:val="000000"/>
-          <w:kern w:val="0"/>
-          <w:sz w:val="19"/>
-          <w:szCs w:val="19"/>
-          <w:highlight w:val="white"/>
-        </w:rPr>
-      </w:pPr>
-    </w:p>
-    <w:p>
-      <w:pPr>
-        <w:bidi w:val="0"/>
-        <w:rPr>
-          <w:b/>
-          <w:bCs/>
-          <w:color w:val="EE0000"/>
-          <w:sz w:val="40"/>
-          <w:szCs w:val="40"/>
-        </w:rPr>
-      </w:pPr>
-      <w:r>
-        <w:rPr>
-          <w:b/>
-          <w:bCs/>
-          <w:color w:val="EE0000"/>
-          <w:sz w:val="40"/>
-          <w:szCs w:val="40"/>
-        </w:rPr>
+        <w:pStyle w:val="Heading1"/>
+        <w:bidi w:val="0"/>
+      </w:pPr>
+      <w:bookmarkStart w:id="7" w:name="_Toc227795091"/>
+      <w:r>
+        <w:lastRenderedPageBreak/>
         <w:t>Segment Tree On Tree</w:t>
       </w:r>
       <w:r>
-        <w:rPr>
-          <w:b/>
-          <w:bCs/>
-          <w:color w:val="EE0000"/>
-          <w:sz w:val="40"/>
-          <w:szCs w:val="40"/>
-        </w:rPr>
         <w:t xml:space="preserve"> (</w:t>
       </w:r>
       <w:r>
-        <w:rPr>
-          <w:b/>
-          <w:bCs/>
-          <w:color w:val="EE0000"/>
-          <w:sz w:val="40"/>
-          <w:szCs w:val="40"/>
-        </w:rPr>
         <w:t xml:space="preserve">Euler’s Tour </w:t>
       </w:r>
       <w:r>
-        <w:rPr>
-          <w:b/>
-          <w:bCs/>
-          <w:color w:val="EE0000"/>
-          <w:sz w:val="40"/>
-          <w:szCs w:val="40"/>
-        </w:rPr>
         <w:t>3</w:t>
       </w:r>
       <w:r>
-        <w:rPr>
-          <w:b/>
-          <w:bCs/>
-          <w:color w:val="EE0000"/>
-          <w:sz w:val="40"/>
-          <w:szCs w:val="40"/>
-        </w:rPr>
         <w:t>):</w:t>
       </w:r>
+      <w:bookmarkEnd w:id="7"/>
     </w:p>
     <w:p>
       <w:pPr>
@@ -1286,7 +2642,7 @@
                     <pic:cNvPicPr/>
                   </pic:nvPicPr>
                   <pic:blipFill>
-                    <a:blip r:embed="rId15" cstate="print">
+                    <a:blip r:embed="rId16" cstate="print">
                       <a:extLst>
                         <a:ext uri="{28A0092B-C50C-407E-A947-70E740481C1C}">
                           <a14:useLocalDpi xmlns:a14="http://schemas.microsoft.com/office/drawing/2010/main" val="0"/>
@@ -1315,66 +2671,32 @@
     </w:p>
     <w:p>
       <w:pPr>
-        <w:bidi w:val="0"/>
-        <w:rPr>
-          <w:b/>
-          <w:bCs/>
-          <w:color w:val="EE0000"/>
-          <w:sz w:val="40"/>
-          <w:szCs w:val="40"/>
-        </w:rPr>
-      </w:pPr>
-      <w:r>
-        <w:rPr>
-          <w:b/>
-          <w:bCs/>
-          <w:color w:val="EE0000"/>
-          <w:sz w:val="40"/>
-          <w:szCs w:val="40"/>
-        </w:rPr>
+        <w:pStyle w:val="Heading1"/>
+        <w:bidi w:val="0"/>
+      </w:pPr>
+      <w:bookmarkStart w:id="8" w:name="_Toc227795092"/>
+      <w:r>
         <w:lastRenderedPageBreak/>
         <w:t>Shortest Path</w:t>
       </w:r>
       <w:r>
-        <w:rPr>
-          <w:b/>
-          <w:bCs/>
-          <w:color w:val="EE0000"/>
-          <w:sz w:val="40"/>
-          <w:szCs w:val="40"/>
-        </w:rPr>
-        <w:t xml:space="preserve"> (</w:t>
-      </w:r>
-      <w:r>
-        <w:rPr>
-          <w:b/>
-          <w:bCs/>
-          <w:color w:val="EE0000"/>
-          <w:sz w:val="40"/>
-          <w:szCs w:val="40"/>
-        </w:rPr>
+        <w:t>:</w:t>
+      </w:r>
+      <w:bookmarkEnd w:id="8"/>
+    </w:p>
+    <w:p>
+      <w:pPr>
+        <w:pStyle w:val="Heading2"/>
+        <w:bidi w:val="0"/>
+      </w:pPr>
+      <w:bookmarkStart w:id="9" w:name="_Toc227795093"/>
+      <w:r>
         <w:t>0-1 BFS</w:t>
       </w:r>
       <w:r>
-        <w:rPr>
-          <w:b/>
-          <w:bCs/>
-          <w:color w:val="EE0000"/>
-          <w:sz w:val="40"/>
-          <w:szCs w:val="40"/>
-        </w:rPr>
-        <w:t>)</w:t>
-      </w:r>
-      <w:r>
-        <w:rPr>
-          <w:b/>
-          <w:bCs/>
-          <w:color w:val="EE0000"/>
-          <w:sz w:val="40"/>
-          <w:szCs w:val="40"/>
-        </w:rPr>
         <w:t>:</w:t>
       </w:r>
+      <w:bookmarkEnd w:id="9"/>
     </w:p>
     <w:p>
       <w:pPr>
@@ -1413,7 +2735,7 @@
                     <pic:cNvPicPr/>
                   </pic:nvPicPr>
                   <pic:blipFill>
-                    <a:blip r:embed="rId16" cstate="print">
+                    <a:blip r:embed="rId17" cstate="print">
                       <a:extLst>
                         <a:ext uri="{28A0092B-C50C-407E-A947-70E740481C1C}">
                           <a14:useLocalDpi xmlns:a14="http://schemas.microsoft.com/office/drawing/2010/main" val="0"/>
@@ -1443,7 +2765,6 @@
     <w:p>
       <w:pPr>
         <w:bidi w:val="0"/>
-        <w:jc w:val="center"/>
         <w:rPr>
           <w:b/>
           <w:bCs/>
@@ -1455,79 +2776,21 @@
     </w:p>
     <w:p>
       <w:pPr>
-        <w:bidi w:val="0"/>
-        <w:jc w:val="center"/>
-        <w:rPr>
-          <w:b/>
-          <w:bCs/>
-          <w:color w:val="EE0000"/>
-          <w:sz w:val="40"/>
-          <w:szCs w:val="40"/>
-        </w:rPr>
-      </w:pPr>
-    </w:p>
-    <w:p>
-      <w:pPr>
-        <w:bidi w:val="0"/>
-        <w:rPr>
-          <w:b/>
-          <w:bCs/>
-          <w:color w:val="EE0000"/>
-          <w:sz w:val="40"/>
-          <w:szCs w:val="40"/>
-        </w:rPr>
-      </w:pPr>
-      <w:r>
-        <w:rPr>
-          <w:b/>
-          <w:bCs/>
-          <w:color w:val="EE0000"/>
-          <w:sz w:val="40"/>
-          <w:szCs w:val="40"/>
-        </w:rPr>
+        <w:pStyle w:val="Heading2"/>
+        <w:bidi w:val="0"/>
+      </w:pPr>
+      <w:bookmarkStart w:id="10" w:name="_Toc227795094"/>
+      <w:r>
         <w:lastRenderedPageBreak/>
-        <w:t>Shortest Path</w:t>
-      </w:r>
-      <w:r>
-        <w:rPr>
-          <w:b/>
-          <w:bCs/>
-          <w:color w:val="EE0000"/>
-          <w:sz w:val="40"/>
-          <w:szCs w:val="40"/>
-        </w:rPr>
-        <w:t xml:space="preserve"> (</w:t>
-      </w:r>
-      <w:r>
-        <w:rPr>
-          <w:b/>
-          <w:bCs/>
-          <w:color w:val="EE0000"/>
-          <w:sz w:val="40"/>
-          <w:szCs w:val="40"/>
-        </w:rPr>
         <w:t>Dijkstra’s</w:t>
       </w:r>
       <w:r>
-        <w:rPr>
-          <w:b/>
-          <w:bCs/>
-          <w:color w:val="EE0000"/>
-          <w:sz w:val="40"/>
-          <w:szCs w:val="40"/>
-        </w:rPr>
-        <w:t xml:space="preserve"> Algorithm)</w:t>
-      </w:r>
-      <w:r>
-        <w:rPr>
-          <w:b/>
-          <w:bCs/>
-          <w:color w:val="EE0000"/>
-          <w:sz w:val="40"/>
-          <w:szCs w:val="40"/>
-        </w:rPr>
+        <w:t xml:space="preserve"> Algorithm</w:t>
+      </w:r>
+      <w:r>
         <w:t>:</w:t>
       </w:r>
+      <w:bookmarkEnd w:id="10"/>
     </w:p>
     <w:p>
       <w:pPr>
@@ -1566,7 +2829,7 @@
                     <pic:cNvPicPr/>
                   </pic:nvPicPr>
                   <pic:blipFill>
-                    <a:blip r:embed="rId17" cstate="print">
+                    <a:blip r:embed="rId18" cstate="print">
                       <a:extLst>
                         <a:ext uri="{28A0092B-C50C-407E-A947-70E740481C1C}">
                           <a14:useLocalDpi xmlns:a14="http://schemas.microsoft.com/office/drawing/2010/main" val="0"/>
@@ -1631,66 +2894,21 @@
     </w:p>
     <w:p>
       <w:pPr>
-        <w:bidi w:val="0"/>
-        <w:rPr>
-          <w:b/>
-          <w:bCs/>
-          <w:color w:val="EE0000"/>
-          <w:sz w:val="40"/>
-          <w:szCs w:val="40"/>
-        </w:rPr>
-      </w:pPr>
-      <w:r>
-        <w:rPr>
-          <w:b/>
-          <w:bCs/>
-          <w:color w:val="EE0000"/>
-          <w:sz w:val="40"/>
-          <w:szCs w:val="40"/>
-        </w:rPr>
+        <w:pStyle w:val="Heading2"/>
+        <w:bidi w:val="0"/>
+      </w:pPr>
+      <w:bookmarkStart w:id="11" w:name="_Toc227795095"/>
+      <w:r>
         <w:lastRenderedPageBreak/>
-        <w:t>Shortest Path</w:t>
-      </w:r>
-      <w:r>
-        <w:rPr>
-          <w:b/>
-          <w:bCs/>
-          <w:color w:val="EE0000"/>
-          <w:sz w:val="40"/>
-          <w:szCs w:val="40"/>
-        </w:rPr>
-        <w:t xml:space="preserve"> (</w:t>
-      </w:r>
-      <w:r>
-        <w:rPr>
-          <w:b/>
-          <w:bCs/>
-          <w:color w:val="EE0000"/>
-          <w:sz w:val="40"/>
-          <w:szCs w:val="40"/>
-        </w:rPr>
         <w:t>Bellman Ford’s</w:t>
       </w:r>
       <w:r>
-        <w:rPr>
-          <w:b/>
-          <w:bCs/>
-          <w:color w:val="EE0000"/>
-          <w:sz w:val="40"/>
-          <w:szCs w:val="40"/>
-        </w:rPr>
-        <w:t xml:space="preserve"> Algorithm)</w:t>
-      </w:r>
-      <w:r>
-        <w:rPr>
-          <w:b/>
-          <w:bCs/>
-          <w:color w:val="EE0000"/>
-          <w:sz w:val="40"/>
-          <w:szCs w:val="40"/>
-        </w:rPr>
+        <w:t xml:space="preserve"> Algorithm</w:t>
+      </w:r>
+      <w:r>
         <w:t>:</w:t>
       </w:r>
+      <w:bookmarkEnd w:id="11"/>
     </w:p>
     <w:p>
       <w:pPr>
@@ -1734,7 +2952,7 @@
                     <pic:cNvPicPr/>
                   </pic:nvPicPr>
                   <pic:blipFill>
-                    <a:blip r:embed="rId18" cstate="print">
+                    <a:blip r:embed="rId19" cstate="print">
                       <a:extLst>
                         <a:ext uri="{28A0092B-C50C-407E-A947-70E740481C1C}">
                           <a14:useLocalDpi xmlns:a14="http://schemas.microsoft.com/office/drawing/2010/main" val="0"/>
@@ -1781,78 +2999,21 @@
     </w:p>
     <w:p>
       <w:pPr>
-        <w:bidi w:val="0"/>
-        <w:rPr>
-          <w:b/>
-          <w:bCs/>
-          <w:color w:val="EE0000"/>
-          <w:sz w:val="40"/>
-          <w:szCs w:val="40"/>
-        </w:rPr>
-      </w:pPr>
-      <w:r>
-        <w:rPr>
-          <w:b/>
-          <w:bCs/>
-          <w:color w:val="EE0000"/>
-          <w:sz w:val="40"/>
-          <w:szCs w:val="40"/>
-        </w:rPr>
+        <w:pStyle w:val="Heading2"/>
+        <w:bidi w:val="0"/>
+      </w:pPr>
+      <w:bookmarkStart w:id="12" w:name="_Toc227795096"/>
+      <w:r>
         <w:lastRenderedPageBreak/>
-        <w:t>Shortest Path</w:t>
-      </w:r>
-      <w:r>
-        <w:rPr>
-          <w:b/>
-          <w:bCs/>
-          <w:color w:val="EE0000"/>
-          <w:sz w:val="40"/>
-          <w:szCs w:val="40"/>
-        </w:rPr>
-        <w:t xml:space="preserve"> (</w:t>
-      </w:r>
-      <w:r>
-        <w:rPr>
-          <w:b/>
-          <w:bCs/>
-          <w:color w:val="EE0000"/>
-          <w:sz w:val="40"/>
-          <w:szCs w:val="40"/>
-        </w:rPr>
-        <w:t xml:space="preserve">Floyd </w:t>
-      </w:r>
-      <w:proofErr w:type="spellStart"/>
-      <w:r>
-        <w:rPr>
-          <w:b/>
-          <w:bCs/>
-          <w:color w:val="EE0000"/>
-          <w:sz w:val="40"/>
-          <w:szCs w:val="40"/>
-        </w:rPr>
-        <w:t>Warshall’s</w:t>
-      </w:r>
-      <w:proofErr w:type="spellEnd"/>
-      <w:r>
-        <w:rPr>
-          <w:b/>
-          <w:bCs/>
-          <w:color w:val="EE0000"/>
-          <w:sz w:val="40"/>
-          <w:szCs w:val="40"/>
-        </w:rPr>
-        <w:t xml:space="preserve"> Algorithm)</w:t>
-      </w:r>
-      <w:r>
-        <w:rPr>
-          <w:b/>
-          <w:bCs/>
-          <w:color w:val="EE0000"/>
-          <w:sz w:val="40"/>
-          <w:szCs w:val="40"/>
-        </w:rPr>
+        <w:t>Floyd Warshall’s</w:t>
+      </w:r>
+      <w:r>
+        <w:t xml:space="preserve"> Algorithm</w:t>
+      </w:r>
+      <w:r>
         <w:t>:</w:t>
       </w:r>
+      <w:bookmarkEnd w:id="12"/>
     </w:p>
     <w:p>
       <w:pPr>
@@ -1914,7 +3075,7 @@
                     <pic:cNvPicPr/>
                   </pic:nvPicPr>
                   <pic:blipFill>
-                    <a:blip r:embed="rId19" cstate="print">
+                    <a:blip r:embed="rId20" cstate="print">
                       <a:extLst>
                         <a:ext uri="{28A0092B-C50C-407E-A947-70E740481C1C}">
                           <a14:useLocalDpi xmlns:a14="http://schemas.microsoft.com/office/drawing/2010/main" val="0"/>
@@ -1978,66 +3139,27 @@
     </w:p>
     <w:p>
       <w:pPr>
-        <w:bidi w:val="0"/>
-        <w:rPr>
-          <w:b/>
-          <w:bCs/>
-          <w:color w:val="EE0000"/>
-          <w:sz w:val="40"/>
-          <w:szCs w:val="40"/>
-        </w:rPr>
-      </w:pPr>
-      <w:r>
-        <w:rPr>
-          <w:b/>
-          <w:bCs/>
-          <w:color w:val="EE0000"/>
-          <w:sz w:val="40"/>
-          <w:szCs w:val="40"/>
-        </w:rPr>
+        <w:pStyle w:val="Heading1"/>
+        <w:bidi w:val="0"/>
+      </w:pPr>
+      <w:bookmarkStart w:id="13" w:name="_Toc227795097"/>
+      <w:r>
         <w:lastRenderedPageBreak/>
         <w:t>Spanning Tree</w:t>
       </w:r>
       <w:r>
-        <w:rPr>
-          <w:b/>
-          <w:bCs/>
-          <w:color w:val="EE0000"/>
-          <w:sz w:val="40"/>
-          <w:szCs w:val="40"/>
-        </w:rPr>
         <w:t xml:space="preserve"> (</w:t>
       </w:r>
       <w:r>
-        <w:rPr>
-          <w:b/>
-          <w:bCs/>
-          <w:color w:val="EE0000"/>
-          <w:sz w:val="40"/>
-          <w:szCs w:val="40"/>
-        </w:rPr>
         <w:t>Kruskal’s</w:t>
       </w:r>
       <w:r>
-        <w:rPr>
-          <w:b/>
-          <w:bCs/>
-          <w:color w:val="EE0000"/>
-          <w:sz w:val="40"/>
-          <w:szCs w:val="40"/>
-        </w:rPr>
         <w:t xml:space="preserve"> Algorithm)</w:t>
       </w:r>
       <w:r>
-        <w:rPr>
-          <w:b/>
-          <w:bCs/>
-          <w:color w:val="EE0000"/>
-          <w:sz w:val="40"/>
-          <w:szCs w:val="40"/>
-        </w:rPr>
         <w:t>:</w:t>
       </w:r>
+      <w:bookmarkEnd w:id="13"/>
     </w:p>
     <w:p>
       <w:pPr>
@@ -2083,7 +3205,7 @@
                     <pic:cNvPicPr/>
                   </pic:nvPicPr>
                   <pic:blipFill>
-                    <a:blip r:embed="rId20" cstate="print">
+                    <a:blip r:embed="rId21" cstate="print">
                       <a:extLst>
                         <a:ext uri="{28A0092B-C50C-407E-A947-70E740481C1C}">
                           <a14:useLocalDpi xmlns:a14="http://schemas.microsoft.com/office/drawing/2010/main" val="0"/>
@@ -2112,66 +3234,27 @@
     </w:p>
     <w:p>
       <w:pPr>
-        <w:bidi w:val="0"/>
-        <w:rPr>
-          <w:b/>
-          <w:bCs/>
-          <w:color w:val="EE0000"/>
-          <w:sz w:val="40"/>
-          <w:szCs w:val="40"/>
-        </w:rPr>
-      </w:pPr>
-      <w:r>
-        <w:rPr>
-          <w:b/>
-          <w:bCs/>
-          <w:color w:val="EE0000"/>
-          <w:sz w:val="40"/>
-          <w:szCs w:val="40"/>
-        </w:rPr>
+        <w:pStyle w:val="Heading1"/>
+        <w:bidi w:val="0"/>
+      </w:pPr>
+      <w:bookmarkStart w:id="14" w:name="_Toc227795098"/>
+      <w:r>
         <w:lastRenderedPageBreak/>
         <w:t>Strongly Connected Components</w:t>
       </w:r>
       <w:r>
-        <w:rPr>
-          <w:b/>
-          <w:bCs/>
-          <w:color w:val="EE0000"/>
-          <w:sz w:val="40"/>
-          <w:szCs w:val="40"/>
-        </w:rPr>
         <w:t xml:space="preserve"> (</w:t>
       </w:r>
       <w:r>
-        <w:rPr>
-          <w:b/>
-          <w:bCs/>
-          <w:color w:val="EE0000"/>
-          <w:sz w:val="40"/>
-          <w:szCs w:val="40"/>
-        </w:rPr>
         <w:t>Tarjan’s</w:t>
       </w:r>
       <w:r>
-        <w:rPr>
-          <w:b/>
-          <w:bCs/>
-          <w:color w:val="EE0000"/>
-          <w:sz w:val="40"/>
-          <w:szCs w:val="40"/>
-        </w:rPr>
         <w:t xml:space="preserve"> Algorithm)</w:t>
       </w:r>
       <w:r>
-        <w:rPr>
-          <w:b/>
-          <w:bCs/>
-          <w:color w:val="EE0000"/>
-          <w:sz w:val="40"/>
-          <w:szCs w:val="40"/>
-        </w:rPr>
         <w:t>:</w:t>
       </w:r>
+      <w:bookmarkEnd w:id="14"/>
     </w:p>
     <w:p>
       <w:pPr>
@@ -2218,7 +3301,7 @@
                     <pic:cNvPicPr/>
                   </pic:nvPicPr>
                   <pic:blipFill>
-                    <a:blip r:embed="rId21" cstate="print">
+                    <a:blip r:embed="rId22" cstate="print">
                       <a:extLst>
                         <a:ext uri="{28A0092B-C50C-407E-A947-70E740481C1C}">
                           <a14:useLocalDpi xmlns:a14="http://schemas.microsoft.com/office/drawing/2010/main" val="0"/>
@@ -2246,7 +3329,7 @@
       </w:r>
     </w:p>
     <w:sectPr>
-      <w:footerReference w:type="default" r:id="rId22"/>
+      <w:footerReference w:type="default" r:id="rId23"/>
       <w:pgSz w:w="11906" w:h="16838"/>
       <w:pgMar w:top="1440" w:right="1440" w:bottom="1440" w:left="1440" w:header="720" w:footer="720" w:gutter="0"/>
       <w:cols w:space="720"/>
@@ -2894,7 +3977,6 @@
     <w:next w:val="Normal"/>
     <w:link w:val="Heading2Char"/>
     <w:uiPriority w:val="9"/>
-    <w:semiHidden/>
     <w:unhideWhenUsed/>
     <w:qFormat/>
     <w:rsid w:val="005A1224"/>
@@ -3110,7 +4192,6 @@
     <w:basedOn w:val="DefaultParagraphFont"/>
     <w:link w:val="Heading2"/>
     <w:uiPriority w:val="9"/>
-    <w:semiHidden/>
     <w:rsid w:val="005A1224"/>
     <w:rPr>
       <w:rFonts w:asciiTheme="majorHAnsi" w:eastAsiaTheme="majorEastAsia" w:hAnsiTheme="majorHAnsi" w:cstheme="majorBidi"/>
@@ -3426,6 +4507,83 @@
     <w:uiPriority w:val="99"/>
     <w:rsid w:val="00E76BFD"/>
   </w:style>
+  <w:style w:type="paragraph" w:styleId="TOCHeading">
+    <w:name w:val="TOC Heading"/>
+    <w:basedOn w:val="Heading1"/>
+    <w:next w:val="Normal"/>
+    <w:uiPriority w:val="39"/>
+    <w:unhideWhenUsed/>
+    <w:qFormat/>
+    <w:rsid w:val="00854832"/>
+    <w:pPr>
+      <w:bidi w:val="0"/>
+      <w:spacing w:before="240" w:after="0" w:line="259" w:lineRule="auto"/>
+      <w:outlineLvl w:val="9"/>
+    </w:pPr>
+    <w:rPr>
+      <w:kern w:val="0"/>
+      <w:sz w:val="32"/>
+      <w:szCs w:val="32"/>
+      <w14:ligatures w14:val="none"/>
+    </w:rPr>
+  </w:style>
+  <w:style w:type="paragraph" w:styleId="TOC1">
+    <w:name w:val="toc 1"/>
+    <w:basedOn w:val="Normal"/>
+    <w:next w:val="Normal"/>
+    <w:autoRedefine/>
+    <w:uiPriority w:val="39"/>
+    <w:unhideWhenUsed/>
+    <w:rsid w:val="00854832"/>
+    <w:pPr>
+      <w:spacing w:after="100"/>
+    </w:pPr>
+  </w:style>
+  <w:style w:type="paragraph" w:styleId="TOC2">
+    <w:name w:val="toc 2"/>
+    <w:basedOn w:val="Normal"/>
+    <w:next w:val="Normal"/>
+    <w:autoRedefine/>
+    <w:uiPriority w:val="39"/>
+    <w:unhideWhenUsed/>
+    <w:rsid w:val="00854832"/>
+    <w:pPr>
+      <w:spacing w:after="100"/>
+      <w:ind w:left="240"/>
+    </w:pPr>
+  </w:style>
+  <w:style w:type="character" w:styleId="Hyperlink">
+    <w:name w:val="Hyperlink"/>
+    <w:basedOn w:val="DefaultParagraphFont"/>
+    <w:uiPriority w:val="99"/>
+    <w:unhideWhenUsed/>
+    <w:rsid w:val="00854832"/>
+    <w:rPr>
+      <w:color w:val="0563C1" w:themeColor="hyperlink"/>
+      <w:u w:val="single"/>
+    </w:rPr>
+  </w:style>
+  <w:style w:type="paragraph" w:styleId="TOC3">
+    <w:name w:val="toc 3"/>
+    <w:basedOn w:val="Normal"/>
+    <w:next w:val="Normal"/>
+    <w:autoRedefine/>
+    <w:uiPriority w:val="39"/>
+    <w:unhideWhenUsed/>
+    <w:rsid w:val="00854832"/>
+    <w:pPr>
+      <w:bidi w:val="0"/>
+      <w:spacing w:after="100" w:line="259" w:lineRule="auto"/>
+      <w:ind w:left="440"/>
+    </w:pPr>
+    <w:rPr>
+      <w:rFonts w:eastAsiaTheme="minorEastAsia" w:cs="Times New Roman"/>
+      <w:kern w:val="0"/>
+      <w:sz w:val="22"/>
+      <w:szCs w:val="22"/>
+      <w14:ligatures w14:val="none"/>
+    </w:rPr>
+  </w:style>
 </w:styles>
 </file>
 
@@ -3722,4 +4880,16 @@
     </a:ext>
   </a:extLst>
 </a:theme>
+</file>
+
+<file path=customXml/item1.xml><?xml version="1.0" encoding="utf-8"?>
+<b:Sources xmlns:b="http://schemas.openxmlformats.org/officeDocument/2006/bibliography" xmlns="http://schemas.openxmlformats.org/officeDocument/2006/bibliography" SelectedStyle="\APASixthEditionOfficeOnline.xsl" StyleName="APA" Version="6"/>
+</file>
+
+<file path=customXml/itemProps1.xml><?xml version="1.0" encoding="utf-8"?>
+<ds:datastoreItem xmlns:ds="http://schemas.openxmlformats.org/officeDocument/2006/customXml" ds:itemID="{AB17EB58-47D7-4379-B40B-D84DABF0DD42}">
+  <ds:schemaRefs>
+    <ds:schemaRef ds:uri="http://schemas.openxmlformats.org/officeDocument/2006/bibliography"/>
+  </ds:schemaRefs>
+</ds:datastoreItem>
 </file>
</xml_diff>